<commit_message>
Scurtează pachetele de review pentru editori, adaugă GHID.csv alăturat
Elimină secțiunea de conținut curent din docx (redundantă cu GHID.csv,
care acum e copiat în fiecare director de capitol) și condensează tot
textul (intro, FYI, chestiuni, comentarii rânduri noi) la un ton scurt,
profesional — feedback după runda de pilot.

Co-Authored-By: Claude Sonnet 5 <noreply@anthropic.com>
Claude-Session: https://claude.ai/code/session_01CB1qxeCwYtJ1rmMiMw8agr
</commit_message>
<xml_diff>
--- a/pentru-editori/00-comun/Decizii-structurale-comune.docx
+++ b/pentru-editori/00-comun/Decizii-structurale-comune.docx
@@ -18,7 +18,7 @@
         <w:rPr>
           <w:i/>
         </w:rPr>
-        <w:t>Acest memo însoțește pachetele de review pe capitol. Conține doar deciziile structurale/organizatorice care traversează capitolele — nu conținut clinic specific. Doar de citit, nu necesită completare.</w:t>
+        <w:t>Decizii organizatorice comune tuturor capitolelor. Doar de citit.</w:t>
       </w:r>
     </w:p>
     <w:p>
@@ -29,12 +29,12 @@
         <w:rPr>
           <w:color w:val="1C5D8C"/>
         </w:rPr>
-        <w:t>Radiologie intervențională — un singur capitol pentru proceduri</w:t>
+        <w:t>Radiologie intervențională — capitol unic pentru proceduri</w:t>
       </w:r>
     </w:p>
     <w:p>
       <w:r>
-        <w:t>Tot ce e intervențional (biopsii, embolizări, drenaje, angiografii terapeutice) a fost adunat într-un singur capitol nou, „Radiologie intervențională”, organizat pe aparate/sisteme. Nu mai apare împrăștiat prin capitolele diagnostice.</w:t>
+        <w:t>Tot ce e intervențional (biopsii, embolizări, drenaje, angiografii terapeutice) e consolidat în capitolul „Radiologie intervențională”, pe aparate/sisteme.</w:t>
       </w:r>
     </w:p>
     <w:p>
@@ -50,7 +50,7 @@
     </w:p>
     <w:p>
       <w:r>
-        <w:t>Intervenționalul mamar (biopsie percutanată, biopsie ganglionară axilară, localizare preoperatorie, drenaj de abces) rămâne în capitolul „Sân”, lângă restul workup-ului senologic — nu s-a mutat la Radiologie intervențională. Senologia e tratată ca specialitate proprie.</w:t>
+        <w:t>Intervenționalul mamar (biopsie percutanată, biopsie ganglionară axilară, localizare preoperatorie, drenaj de abces) rămâne în capitolul „Sân”.</w:t>
       </w:r>
     </w:p>
     <w:p>
@@ -66,7 +66,7 @@
     </w:p>
     <w:p>
       <w:r>
-        <w:t>ERCP rămâne în capitolul de origine (nu la Radiologie intervențională), deși are și rol terapeutic (sfincterotomie, extragere de calculi, stentare) — marcat „Terapeutic = Da”.</w:t>
+        <w:t>ERCP rămâne în capitolul de origine, marcat „Terapeutic = Da”.</w:t>
       </w:r>
     </w:p>
     <w:p>
@@ -82,7 +82,7 @@
     </w:p>
     <w:p>
       <w:r>
-        <w:t>Deși e determinat de malignitate, cancerul de sân (diagnostic, stadializare, urmărire) nu a fost mutat la capitolul „Cancer” — rămâne în „Sân”, subcapitolul „Cancer de sân”, analog excepției ERCP.</w:t>
+        <w:t>Nu e mutat la capitolul „Cancer” — rămâne în „Sân”, subcapitolul „Cancer de sân”.</w:t>
       </w:r>
     </w:p>
     <w:p>
@@ -98,7 +98,7 @@
     </w:p>
     <w:p>
       <w:r>
-        <w:t>Marchează dacă o investigație/procedură are și rol terapeutic, chiar dacă e și diagnostică (ex. embolizare, ablație, drenaj = Da; biopsie, angiografie diagnostică = Nu). Gol doar la rândurile-placeholder.</w:t>
+        <w:t>Da = rol terapeutic, chiar dacă e și diagnostic (ex. embolizare, ablație, drenaj = Da; biopsie, angiografie diagnostică = Nu).</w:t>
       </w:r>
     </w:p>
     <w:p>
@@ -109,12 +109,12 @@
         <w:rPr>
           <w:color w:val="1C5D8C"/>
         </w:rPr>
-        <w:t>Numerotarea rândurilor (NR.CRT) nu are semnificație clinică</w:t>
+        <w:t>NR.CRT nu are semnificație clinică</w:t>
       </w:r>
     </w:p>
     <w:p>
       <w:r>
-        <w:t>E doar un identificator secvențial de rând; a fost renumerotat de mai multe ori în timpul revizuirii și poate diferi de numerele din ediția pe care o cunoașteți. Vă rugăm să vă referiți la rânduri prin „Capitol + Situație clinică”, nu prin numărul curent.</w:t>
+        <w:t>Identificator secvențial de rând, renumerotat pe parcursul revizuirii. Referiți-vă la rânduri prin „Capitol + Situație clinică”, nu prin număr.</w:t>
       </w:r>
     </w:p>
     <w:p>
@@ -125,12 +125,12 @@
         <w:rPr>
           <w:color w:val="1C5D8C"/>
         </w:rPr>
-        <w:t>Un rând = un singur „acasă” (fără trimiteri încrucișate)</w:t>
+        <w:t>Un rând = un singur „acasă”</w:t>
       </w:r>
     </w:p>
     <w:p>
       <w:r>
-        <w:t>Fiecare situație clinică apare într-un singur capitol/subcapitol, ales după o ierarhie fixă (context special — pediatric, traumă, oncologic, intervențional — înaintea anatomiei). Nu mai există trimiteri de tipul „vezi și capitolul X” în date.</w:t>
+        <w:t>Fiecare situație clinică apare într-un singur capitol/subcapitol; fără trimiteri încrucișate de tipul „vezi și capitolul X”.</w:t>
       </w:r>
     </w:p>
     <w:p>
@@ -146,7 +146,7 @@
     </w:p>
     <w:p>
       <w:r>
-        <w:t>Ordinea investigațiilor în cadrul unei situații clinice este intenționată (reflectă prioritatea clinică) și nu a fost reordonată. Situațiile clinice din cadrul unui subcapitol au fost, unde a fost cazul, reordonate după fluxul clinic (urgență/acut → cronic → screening), nu alfabetic.</w:t>
+        <w:t>Ordinea investigațiilor într-o situație e intenționată, neschimbată. Situațiile clinice sunt ordonate după flux clinic (acut → cronic → screening), nu alfabetic.</w:t>
       </w:r>
     </w:p>
     <w:sectPr>

</xml_diff>

<commit_message>
Îmbogățește memo-ul comun: context, ierarhia capitolelor, ce nu s-a schimbat
Adaugă raționamentul de restructurare pe care editorii îl citesc înaintea
pachetului de capitol: de ce a plecat conținut din capitolele anatomice
(ierarhia pediatrie/RI/cancer/traumă înaintea anatomiei) și o reasigurare
explicită că gradele, dozele și ordinea examenelor nu au fost modificate
unilateral.

Co-Authored-By: Claude Sonnet 5 <noreply@anthropic.com>
Claude-Session: https://claude.ai/code/session_01CB1qxeCwYtJ1rmMiMw8agr
</commit_message>
<xml_diff>
--- a/pentru-editori/00-comun/Decizii-structurale-comune.docx
+++ b/pentru-editori/00-comun/Decizii-structurale-comune.docx
@@ -18,7 +18,23 @@
         <w:rPr>
           <w:i/>
         </w:rPr>
-        <w:t>Decizii organizatorice comune tuturor capitolelor. Doar de citit.</w:t>
+        <w:t>Prima revizuire a ghidului de la aprobarea din 2021. Runda aceasta: curățare structurală, deduplicare și completarea golurilor de conținut — nu o rescriere clinică. Decizii organizatorice comune tuturor capitolelor, de citit înainte de pachetul dvs. de capitol.</w:t>
+      </w:r>
+    </w:p>
+    <w:p>
+      <w:pPr>
+        <w:pStyle w:val="Heading2"/>
+      </w:pPr>
+      <w:r>
+        <w:rPr>
+          <w:color w:val="1C5D8C"/>
+        </w:rPr>
+        <w:t>Ierarhia capitolelor — de ce a plecat conținut din capitolul dvs.</w:t>
+      </w:r>
+    </w:p>
+    <w:p>
+      <w:r>
+        <w:t>Un rând stă într-un singur capitol, ales după context, în această ordine: (1) pacient pediatric → Pediatrie; (2) procedură intervențională → Radiologie intervențională; (3) malignitate cunoscută/suspectată → Cancer; (4) traumă acută → Traumatisme; (5) altfel → capitolul anatomic. De asta conținutul pediatric, oncologic, traumatic sau intervențional din capitolul dvs. anatomic s-a mutat — nu a fost șters.</w:t>
       </w:r>
     </w:p>
     <w:p>
@@ -141,12 +157,28 @@
         <w:rPr>
           <w:color w:val="1C5D8C"/>
         </w:rPr>
-        <w:t>Ordinea examenelor și a situațiilor clinice</w:t>
+        <w:t>Ce nu s-a schimbat</w:t>
       </w:r>
     </w:p>
     <w:p>
       <w:r>
-        <w:t>Ordinea investigațiilor într-o situație e intenționată, neschimbată. Situațiile clinice sunt ordonate după flux clinic (acut → cronic → screening), nu alfabetic.</w:t>
+        <w:t>Gradele de indicație, dozele și ordinea examenelor în cadrul unei situații nu au fost modificate unilateral. Unde ceva pare greșit, e semnalat ca discuție deschisă în pachetul de capitol — nu corectat de noi.</w:t>
+      </w:r>
+    </w:p>
+    <w:p>
+      <w:pPr>
+        <w:pStyle w:val="Heading2"/>
+      </w:pPr>
+      <w:r>
+        <w:rPr>
+          <w:color w:val="1C5D8C"/>
+        </w:rPr>
+        <w:t>Ordinea situațiilor clinice</w:t>
+      </w:r>
+    </w:p>
+    <w:p>
+      <w:r>
+        <w:t>Situațiile clinice dintr-un subcapitol sunt ordonate după flux clinic (acut → cronic → screening), nu alfabetic.</w:t>
       </w:r>
     </w:p>
     <w:sectPr>

</xml_diff>

<commit_message>
Terminologie: situație/indicație în loc de rând; senologie tratată ca pediatria
Memo comun: intro simplificat („revizie a ghidului aprobat în 2021”),
raționamentul ierarhiei explicat prin cum gândește clinicianul/rezidentul,
senologia unificată într-un singur punct (ca domeniu propriu, alături de
pediatrie, nu ca excepție separată la RI și Cancer), scos „nu corectat de
noi”, adăugat un rând de închidere care invită propuneri de schimbare.

Docx de capitol: secțiunea „Rânduri noi propuse” redenumită „Propuneri
noi”, aliniată la cheia YAML „propuneri”.

Co-Authored-By: Claude Sonnet 5 <noreply@anthropic.com>
Claude-Session: https://claude.ai/code/session_01CB1qxeCwYtJ1rmMiMw8agr
</commit_message>
<xml_diff>
--- a/pentru-editori/00-comun/Decizii-structurale-comune.docx
+++ b/pentru-editori/00-comun/Decizii-structurale-comune.docx
@@ -18,7 +18,7 @@
         <w:rPr>
           <w:i/>
         </w:rPr>
-        <w:t>Prima revizuire a ghidului de la aprobarea din 2021. Runda aceasta: curățare structurală, deduplicare și completarea golurilor de conținut — nu o rescriere clinică. Decizii organizatorice comune tuturor capitolelor, de citit înainte de pachetul dvs. de capitol.</w:t>
+        <w:t>Revizie a ghidului aprobat în 2021: curățare structurală, deduplicare, completarea golurilor de conținut. Decizii comune tuturor capitolelor — de citit înainte de pachetul dvs. de capitol.</w:t>
       </w:r>
     </w:p>
     <w:p>
@@ -34,7 +34,7 @@
     </w:p>
     <w:p>
       <w:r>
-        <w:t>Un rând stă într-un singur capitol, ales după context, în această ordine: (1) pacient pediatric → Pediatrie; (2) procedură intervențională → Radiologie intervențională; (3) malignitate cunoscută/suspectată → Cancer; (4) traumă acută → Traumatisme; (5) altfel → capitolul anatomic. De asta conținutul pediatric, oncologic, traumatic sau intervențional din capitolul dvs. anatomic s-a mutat — nu a fost șters.</w:t>
+        <w:t>O situație clinică stă într-un singur capitol. Logica: ghidul urmează cum gândește clinicianul — sau rezidentul/studentul, cui i se adresează ghidul — în fața unui caz: mai întâi contextul, apoi anatomia. Ordinea: (1) pacient pediatric → Pediatrie; (2) procedură intervențională → Radiologie intervențională; (3) malignitate cunoscută/suspectată → Cancer; (4) traumă acută → Traumatisme; (5) altfel → capitolul anatomic. De asta conținutul pediatric, oncologic, traumatic sau intervențional din capitolul dvs. anatomic s-a mutat — nu a fost șters. Senologia, ca și pediatria, e considerată separat: tot ce ține de sân (inclusiv intervențional și cancer de sân) rămâne în capitolul „Sân”, indiferent de regulile de mai sus.</w:t>
       </w:r>
     </w:p>
     <w:p>
@@ -61,44 +61,12 @@
         <w:rPr>
           <w:color w:val="1C5D8C"/>
         </w:rPr>
-        <w:t>Excepție — senologie</w:t>
-      </w:r>
-    </w:p>
-    <w:p>
-      <w:r>
-        <w:t>Intervenționalul mamar (biopsie percutanată, biopsie ganglionară axilară, localizare preoperatorie, drenaj de abces) rămâne în capitolul „Sân”.</w:t>
-      </w:r>
-    </w:p>
-    <w:p>
-      <w:pPr>
-        <w:pStyle w:val="Heading2"/>
-      </w:pPr>
-      <w:r>
-        <w:rPr>
-          <w:color w:val="1C5D8C"/>
-        </w:rPr>
         <w:t>Excepție — ERCP</w:t>
       </w:r>
     </w:p>
     <w:p>
       <w:r>
         <w:t>ERCP rămâne în capitolul de origine, marcat „Terapeutic = Da”.</w:t>
-      </w:r>
-    </w:p>
-    <w:p>
-      <w:pPr>
-        <w:pStyle w:val="Heading2"/>
-      </w:pPr>
-      <w:r>
-        <w:rPr>
-          <w:color w:val="1C5D8C"/>
-        </w:rPr>
-        <w:t>Cancerul de sân rămâne în „Sân”</w:t>
-      </w:r>
-    </w:p>
-    <w:p>
-      <w:r>
-        <w:t>Nu e mutat la capitolul „Cancer” — rămâne în „Sân”, subcapitolul „Cancer de sân”.</w:t>
       </w:r>
     </w:p>
     <w:p>
@@ -130,7 +98,7 @@
     </w:p>
     <w:p>
       <w:r>
-        <w:t>Identificator secvențial de rând, renumerotat pe parcursul revizuirii. Referiți-vă la rânduri prin „Capitol + Situație clinică”, nu prin număr.</w:t>
+        <w:t>Identificator secvențial, renumerotat pe parcursul revizuirii. Referiți-vă la situații prin „Capitol + Situație clinică”, nu prin număr.</w:t>
       </w:r>
     </w:p>
     <w:p>
@@ -141,7 +109,7 @@
         <w:rPr>
           <w:color w:val="1C5D8C"/>
         </w:rPr>
-        <w:t>Un rând = un singur „acasă”</w:t>
+        <w:t>O situație clinică = un singur „acasă”</w:t>
       </w:r>
     </w:p>
     <w:p>
@@ -162,7 +130,7 @@
     </w:p>
     <w:p>
       <w:r>
-        <w:t>Gradele de indicație, dozele și ordinea examenelor în cadrul unei situații nu au fost modificate unilateral. Unde ceva pare greșit, e semnalat ca discuție deschisă în pachetul de capitol — nu corectat de noi.</w:t>
+        <w:t>Gradele de indicație, dozele și ordinea examenelor în cadrul unei situații nu au fost modificate unilateral. Unde ceva pare greșit, e semnalat ca discuție deschisă în pachetul de capitol.</w:t>
       </w:r>
     </w:p>
     <w:p>
@@ -179,6 +147,14 @@
     <w:p>
       <w:r>
         <w:t>Situațiile clinice dintr-un subcapitol sunt ordonate după flux clinic (acut → cronic → screening), nu alfabetic.</w:t>
+      </w:r>
+    </w:p>
+    <w:p>
+      <w:r>
+        <w:rPr>
+          <w:i/>
+        </w:rPr>
+        <w:t>Orice altă propunere de schimbare este binevenită și va fi discutată.</w:t>
       </w:r>
     </w:p>
     <w:sectPr>

</xml_diff>

<commit_message>
Adaugă întrebarea de board pe macro-structură (§44) în memo + editorial
- 00-comun: secțiune nouă „Întrebare de board — structura de capitole” cu
  cele 4 fragmentări transversale și direcția propusă (fuziune neuro/coloană
  și ORL/gât), marcată explicit ca discuție separată, post-review, nedecisă.
- EDITORIAL-decisions.md §44: propunerea concretă completă (structura-țintă
  13 capitole, ce se schimbă, 5 puncte deschise, pârghia navigării în aplicație).
- CLAUDE.md: pointer în „Decizii încă deschise”.

Nicio modificare de date sau structură — doar consemnarea unei chestiuni de board.

Co-Authored-By: Claude Sonnet 5 <noreply@anthropic.com>
Claude-Session: https://claude.ai/code/session_01CB1qxeCwYtJ1rmMiMw8agr
</commit_message>
<xml_diff>
--- a/pentru-editori/00-comun/Decizii-structurale-comune.docx
+++ b/pentru-editori/00-comun/Decizii-structurale-comune.docx
@@ -147,6 +147,59 @@
     <w:p>
       <w:r>
         <w:t>Situațiile clinice dintr-un subcapitol sunt ordonate după flux clinic (acut → cronic → screening), nu alfabetic.</w:t>
+      </w:r>
+    </w:p>
+    <w:p>
+      <w:pPr>
+        <w:pStyle w:val="Heading2"/>
+      </w:pPr>
+      <w:r>
+        <w:rPr>
+          <w:color w:val="1C5D8C"/>
+        </w:rPr>
+        <w:t>Întrebare de board (după acest review) — structura de capitole</w:t>
+      </w:r>
+    </w:p>
+    <w:p>
+      <w:r>
+        <w:t>Structura actuală (context întâi, apoi anatomie) rămâne. Punem însă pe masă, pentru o discuție separată de board după acest review, dacă merită reparate câteva fragmentări transversale. Nu afectează pachetul de față.</w:t>
+      </w:r>
+    </w:p>
+    <w:p>
+      <w:pPr>
+        <w:pStyle w:val="ListBullet"/>
+      </w:pPr>
+      <w:r>
+        <w:t>Axul neuro e tăiat între „Cap › Neuro” și „Coloană vertebrală” — encefalul, separat de măduvă și coloană.</w:t>
+      </w:r>
+    </w:p>
+    <w:p>
+      <w:pPr>
+        <w:pStyle w:val="ListBullet"/>
+      </w:pPr>
+      <w:r>
+        <w:t>Sfera ORL e tăiată între „Cap › ORL” și „Gât (părți moi)”.</w:t>
+      </w:r>
+    </w:p>
+    <w:p>
+      <w:pPr>
+        <w:pStyle w:val="ListBullet"/>
+      </w:pPr>
+      <w:r>
+        <w:t>Patologia vasculară e împrăștiată (cord la Cardiovascular, carotidă la Neuro, periferic la Radiologie intervențională).</w:t>
+      </w:r>
+    </w:p>
+    <w:p>
+      <w:pPr>
+        <w:pStyle w:val="ListBullet"/>
+      </w:pPr>
+      <w:r>
+        <w:t>Patologia endocrină e împrăștiată (tiroidă la Gât, suprarenale la Uro-genital, hipofiză la Cap).</w:t>
+      </w:r>
+    </w:p>
+    <w:p>
+      <w:r>
+        <w:t>Direcția propusă, de detaliat la board: un capitol „Sistem nervos” (encefal + măduvă + coloană vertebrală) și un capitol „Cap și gât” (ORL + tiroidă + mase cervicale). Nimic din toate acestea nu se decide acum.</w:t>
       </w:r>
     </w:p>
     <w:p>

</xml_diff>